<commit_message>
Referidos: todo en usted; via directa (el estudiante da el numero con aviso previo, mensaje primero con salida); egresados por llamada
Co-Authored-By: Claude Fable 5.1 <noreply@anthropic.com>
</commit_message>
<xml_diff>
--- a/recursos/comercial/HOJA_ARRANQUE_REFERIDOS_DOCENTE.docx
+++ b/recursos/comercial/HOJA_ARRANQUE_REFERIDOS_DOCENTE.docx
@@ -39,7 +39,7 @@
           <w:color w:val="E54C09"/>
           <w:sz w:val="23"/>
         </w:rPr>
-        <w:t>1. QUÉ VAS A HACER</w:t>
+        <w:t>1. QUÉ VA A HACER</w:t>
       </w:r>
     </w:p>
     <w:p>
@@ -51,7 +51,7 @@
           <w:b w:val="0"/>
           <w:sz w:val="20"/>
         </w:rPr>
-        <w:t>Traer estudiantes nuevos por recomendación de los que ya están y de los que ya terminaron, y cerrarlos tú mismo. Quince días, con metas claras. No das clases durante el piloto: tu tiempo es para esto.</w:t>
+        <w:t>Traer estudiantes nuevos por recomendación de los que ya están y de los que ya terminaron, y cerrarlos usted mismo. Quince días, con metas claras. No dicta clases durante el piloto: su tiempo es para esto.</w:t>
       </w:r>
     </w:p>
     <w:p>
@@ -70,7 +70,7 @@
         <w:rPr>
           <w:sz w:val="20"/>
         </w:rPr>
-        <w:t>Pasar por TODOS los grupos activos entre el miércoles 15 y el viernes 17: 30 segundos al cierre de cada clase, con el profe titular presente (guion abajo).</w:t>
+        <w:t>Pasar por TODOS los grupos activos entre el miércoles 15 y el viernes 17: 30 segundos al cierre de cada clase, con el profe titular presente (guion abajo). Sale de cada grupo con nombres y números.</w:t>
       </w:r>
     </w:p>
     <w:p>
@@ -89,7 +89,7 @@
         <w:rPr>
           <w:sz w:val="20"/>
         </w:rPr>
-        <w:t>Contactar a TODOS los egresados entre el 15 y el 22: primero un mensaje, luego una llamada de 2 minutos (guion abajo).</w:t>
+        <w:t>Llamar a TODOS los egresados entre el 15 y el 22 (guion abajo). Si no contestan, un mensaje y se reintenta al día siguiente.</w:t>
       </w:r>
     </w:p>
     <w:p>
@@ -108,7 +108,7 @@
         <w:rPr>
           <w:sz w:val="20"/>
         </w:rPr>
-        <w:t>Atender a cada referido que escriba, perfilarlo, llevarlo a una clase de prueba y a la asesoría, y cerrar la matrícula.</w:t>
+        <w:t>Contactar a cada referido el MISMO día que recibe el número, perfilarlo, llevarlo a una clase de prueba y a la asesoría, y cerrar la matrícula.</w:t>
       </w:r>
     </w:p>
     <w:p>
@@ -127,7 +127,7 @@
         <w:rPr>
           <w:sz w:val="20"/>
         </w:rPr>
-        <w:t>Mensaje de 3 líneas todos los días a las 6:00 p.m. a gerencia: a quién le pediste hoy, cuántos escribieron, citas agendadas. Y 5 líneas los lunes.</w:t>
+        <w:t>Mensaje de 3 líneas todos los días a las 6:00 p.m. a gerencia: a quién le pidió hoy, cuántos referidos nuevos, citas agendadas. Y 5 líneas los lunes.</w:t>
       </w:r>
     </w:p>
     <w:p>
@@ -140,7 +140,7 @@
           <w:color w:val="E54C09"/>
           <w:sz w:val="23"/>
         </w:rPr>
-        <w:t>2. QUÉ GANAS</w:t>
+        <w:t>2. QUÉ GANA</w:t>
       </w:r>
     </w:p>
     <w:tbl>
@@ -248,7 +248,7 @@
                 <w:b/>
                 <w:sz w:val="19"/>
               </w:rPr>
-              <w:t>Tú cierras la matrícula</w:t>
+              <w:t>Usted cierra la matrícula</w:t>
             </w:r>
           </w:p>
         </w:tc>
@@ -316,7 +316,7 @@
                 <w:b/>
                 <w:sz w:val="19"/>
               </w:rPr>
-              <w:t>La cierra la asesora (solo si venció tu plazo)</w:t>
+              <w:t>La cierra la asesora (solo si venció su plazo)</w:t>
             </w:r>
           </w:p>
         </w:tc>
@@ -410,7 +410,7 @@
         <w:rPr>
           <w:sz w:val="20"/>
         </w:rPr>
-        <w:t>Las primeras 2 matrículas las cierras con la asesora al lado: tú conduces y cobras tu 5% completo. Desde la tercera, solo.</w:t>
+        <w:t>Las primeras 2 matrículas las cierra con la asesora al lado: usted conduce y cobra su 5% completo. Desde la tercera, solo.</w:t>
       </w:r>
     </w:p>
     <w:p>
@@ -429,7 +429,7 @@
         <w:rPr>
           <w:sz w:val="20"/>
         </w:rPr>
-        <w:t>Tú no cobras bono de estudiante. El bono es para quien refiere: $150.000 (completo), $75.000 (Arranque); en cuotas, mitad con la inicial y mitad con la cuota 3. Lo elige en plata, abono a su cuota o 2 horas 1-a-1. Se paga cuando el referido pagó la inicial y llegó a su clase 5.</w:t>
+        <w:t>Usted no cobra bono de estudiante. El bono es para quien refiere: $150.000 (completo), $75.000 (Arranque); en cuotas, mitad con la inicial y mitad con la cuota 3. Lo elige en plata, abono a su cuota o 2 horas 1-a-1. Se paga cuando el referido pagó la inicial y llegó a su clase 5.</w:t>
       </w:r>
     </w:p>
     <w:p>
@@ -442,7 +442,7 @@
           <w:color w:val="E54C09"/>
           <w:sz w:val="23"/>
         </w:rPr>
-        <w:t>3. CÓMO FUNCIONA (y la regla que no se salta)</w:t>
+        <w:t>3. CÓMO FUNCIONA</w:t>
       </w:r>
     </w:p>
     <w:p>
@@ -454,7 +454,7 @@
           <w:b/>
           <w:sz w:val="20"/>
         </w:rPr>
-        <w:t>Nadie te da el número de nadie. El estudiante o el egresado le reenvía un mensaje a su amigo, y el amigo le escribe a Heiiu: "Vengo de parte de…". Es la ley de datos: si pedimos el número del amigo sin su permiso, la multa es para la academia.</w:t>
+        <w:t>El estudiante o el egresado le da el nombre y el número de su amigo, después de avisarle que Heiiu le va a escribir de su parte. Usted escribe primero (nunca llama en frío) y en ese mensaje le da la salida: si dice que no, se borra el número y no se insiste. Esa es la única regla que no se salta.</w:t>
       </w:r>
     </w:p>
     <w:tbl>
@@ -538,7 +538,7 @@
               <w:rPr>
                 <w:sz w:val="19"/>
               </w:rPr>
-              <w:t>Haces la ronda (o la llamada al egresado) y ese mismo día gerencia manda al grupo el mensaje para reenviar.</w:t>
+              <w:t>Ronda en el grupo o llamada al egresado. Sale con nombre y número de UNA persona por estudiante, y el estudiante le avisa a su amigo ese mismo día.</w:t>
             </w:r>
           </w:p>
         </w:tc>
@@ -574,7 +574,7 @@
               <w:rPr>
                 <w:sz w:val="19"/>
               </w:rPr>
-              <w:t>El estudiante se lo reenvía a UNA persona concreta.</w:t>
+              <w:t>Registra al referido en la planilla ANTES de escribirle: nombre, número, quién lo refiere, fecha.</w:t>
             </w:r>
           </w:p>
         </w:tc>
@@ -610,7 +610,7 @@
               <w:rPr>
                 <w:sz w:val="19"/>
               </w:rPr>
-              <w:t>El amigo escribe a la línea de referidos: "Vengo de parte de [nombre]".</w:t>
+              <w:t>Le escribe ese mismo día desde la línea de referidos de Heiiu, con el mensaje de abajo: "[nombre] nos dio su número… ¿puedo llamarle 5 minutos?".</w:t>
             </w:r>
           </w:p>
         </w:tc>
@@ -646,7 +646,7 @@
               <w:rPr>
                 <w:sz w:val="19"/>
               </w:rPr>
-              <w:t>Tú respondes desde esa línea con el aviso de datos y pides el SÍ. Sin SÍ, no se escribe más. Lo anotas en la planilla ANTES de cualquier otra cosa.</w:t>
+              <w:t>Si responde SÍ o contesta la llamada, sigue. Si responde NO, lo borra y lo marca en la planilla. Si no responde en 24 horas, una llamada en horario legal; si tampoco, un último mensaje al tercer día y se cierra.</w:t>
             </w:r>
           </w:p>
         </w:tc>
@@ -682,7 +682,7 @@
               <w:rPr>
                 <w:sz w:val="19"/>
               </w:rPr>
-              <w:t>Perfilas: para qué necesita el inglés · desde cero o ya estudió (y qué pasó) · presencial y jornada · El Pacto ("¿te le mides a ese ritmo?") · contado o inicial del 20% y cuotas.</w:t>
+              <w:t>Perfila: para qué necesita el inglés · desde cero o ya estudió (y qué pasó) · presencial y jornada · El Pacto ("¿se le mide a ese ritmo?") · contado o inicial del 20% y cuotas.</w:t>
             </w:r>
           </w:p>
         </w:tc>
@@ -718,7 +718,7 @@
               <w:rPr>
                 <w:sz w:val="19"/>
               </w:rPr>
-              <w:t>Agendas la clase de prueba (con quien lo refirió, el día que diga coordinación) y la asesoría por llamada de WhatsApp. Presencial solo si él lo pide.</w:t>
+              <w:t>Agenda la clase de prueba (con quien lo refirió, el día que diga coordinación) y la asesoría por llamada de WhatsApp. Presencial solo si él lo pide.</w:t>
             </w:r>
           </w:p>
         </w:tc>
@@ -754,7 +754,7 @@
               <w:rPr>
                 <w:sz w:val="19"/>
               </w:rPr>
-              <w:t>Cierras con el tarifario oficial. El pago entra SOLO a la cuenta de Heiiu; contrato y recibo los hace coordinación en la sede.</w:t>
+              <w:t>Cierra con el tarifario oficial. El pago entra SOLO a la cuenta de Heiiu; contrato y recibo los hace coordinación en la sede.</w:t>
             </w:r>
           </w:p>
         </w:tc>
@@ -794,7 +794,7 @@
         <w:rPr>
           <w:sz w:val="20"/>
         </w:rPr>
-        <w:t>Solo desde la línea de referidos de Heiiu, nunca desde tu celular. Las listas de estudiantes y egresados no salen de la planilla.</w:t>
+        <w:t>Solo desde la línea de referidos de Heiiu, nunca desde su celular. Las listas de estudiantes, egresados y referidos no salen de la planilla.</w:t>
       </w:r>
     </w:p>
     <w:p>
@@ -813,7 +813,7 @@
         <w:rPr>
           <w:sz w:val="20"/>
         </w:rPr>
-        <w:t>Precios, becas y planes oficiales, sin descuentos ni promesas (fácil, rápido, empleo, visa). Se dice lo duro antes de firmar: video diario, asistencia. Nunca recibes dinero. No firmas nada en nombre de Heiiu.</w:t>
+        <w:t>Precios, becas y planes oficiales, sin descuentos ni promesas (fácil, rápido, empleo, visa). Se dice lo duro antes de firmar: video diario, asistencia. Nunca recibe dinero. No firma nada en nombre de Heiiu.</w:t>
       </w:r>
     </w:p>
     <w:p>
@@ -832,7 +832,7 @@
         <w:rPr>
           <w:sz w:val="20"/>
         </w:rPr>
-        <w:t>Cita en 7 días y cierre en 14 desde que el referido escribió. Si no, pasa a la asesora y tú quedas con el 2%.</w:t>
+        <w:t>Cita en 7 días y cierre en 14 desde el registro del referido. Si no, pasa a la asesora y usted queda con el 2%.</w:t>
       </w:r>
     </w:p>
     <w:p>
@@ -870,7 +870,7 @@
         <w:rPr>
           <w:sz w:val="20"/>
         </w:rPr>
-        <w:t>Cuenta solo el que escribe "de parte de" y no estaba en la base en los últimos 30 días. No cuentan personal de Heiiu ni tus familiares. El bono no se usa como argumento ante el referido.</w:t>
+        <w:t>Cuenta el referido registrado en la planilla antes del primer contacto y que no estaba en la base en los últimos 30 días. No cuentan personal de Heiiu ni sus familiares. El bono no se usa como argumento ante el referido.</w:t>
       </w:r>
     </w:p>
     <w:p>
@@ -1003,7 +1003,7 @@
               <w:rPr>
                 <w:sz w:val="19"/>
               </w:rPr>
-              <w:t>15 referidos que escriben (1 por día hábil)</w:t>
+              <w:t>15 referidos registrados y contactados (1 por día hábil)</w:t>
             </w:r>
           </w:p>
         </w:tc>
@@ -1039,7 +1039,7 @@
               <w:rPr>
                 <w:sz w:val="19"/>
               </w:rPr>
-              <w:t>Todos los egresados: mensaje y llamada</w:t>
+              <w:t>Todos los egresados, por llamada</w:t>
             </w:r>
           </w:p>
         </w:tc>
@@ -1091,7 +1091,7 @@
               <w:rPr>
                 <w:sz w:val="19"/>
               </w:rPr>
-              <w:t>Atender, perfilar, clase de prueba, cerrar · reporte 6:00 p.m.</w:t>
+              <w:t>Contactar, perfilar, clase de prueba, cerrar · reporte 6:00 p.m.</w:t>
             </w:r>
           </w:p>
         </w:tc>
@@ -1159,7 +1159,7 @@
               <w:rPr>
                 <w:sz w:val="19"/>
               </w:rPr>
-              <w:t>Si no hay ni 5 que escriben, se corrige el guion y se repite</w:t>
+              <w:t>Si no hay ni 5 referidos registrados, se corrige el guion y se repite</w:t>
             </w:r>
           </w:p>
         </w:tc>
@@ -1223,11 +1223,11 @@
               <w:br/>
               <w:t>Piensen en UNA persona que necesite inglés de verdad: para el trabajo, para irse, para su hijo. ¿Ya la tienen?</w:t>
               <w:br/>
-              <w:t>No me den su número. Hoy les llega al grupo un mensaje: reenvíenselo a esa persona. Si escribe, se matricula</w:t>
+              <w:t>Hoy mismo me dan su nombre y su número, y le avisan que Heiiu le va a escribir de parte de ustedes.</w:t>
               <w:br/>
-              <w:t>y llega a su clase 5, ustedes reciben $150.000, un abono a su cuota o 2 horas 1-a-1. Ustedes eligen.</w:t>
+              <w:t>Si se matricula y llega a su clase 5, ustedes reciben $150.000, un abono a su cuota o 2 horas 1-a-1. Ustedes eligen.</w:t>
               <w:br/>
-              <w:t>Y su amigo puede venir a una clase con ustedes antes de decidir. ¿Quién ya pensó en alguien? Escríbanle hoy."</w:t>
+              <w:t>Y su amigo puede venir a una clase con ustedes antes de decidir. ¿Quién ya pensó en alguien? Me lo dicen ahora."</w:t>
             </w:r>
           </w:p>
         </w:tc>
@@ -1247,7 +1247,7 @@
           <w:b/>
           <w:sz w:val="20"/>
         </w:rPr>
-        <w:t>Primer mensaje al egresado (antes de llamar):</w:t>
+        <w:t>Llamada al egresado (2 minutos, en horario legal; si no contesta, el mensaje de abajo):</w:t>
       </w:r>
     </w:p>
     <w:tbl>
@@ -1274,11 +1274,13 @@
                 <w:i/>
                 <w:sz w:val="19"/>
               </w:rPr>
-              <w:t>Hola [nombre], soy Juan Diego, profesor de Heiiu. Terminaste [nivel] con nosotros en [mes]. Te escribo por una sola cosa:</w:t>
+              <w:t>"Buenos días, [nombre], le habla Juan Diego, profesor de Heiiu. Usted terminó [nivel] con nosotros en [mes]. ¿Cómo le ha ido con el inglés?</w:t>
               <w:br/>
-              <w:t>¿tienes 2 minutos para que te llame hoy o mañana? Es sobre una persona que tú conozcas que necesite inglés.</w:t>
+              <w:t>Le llamo por una sola cosa: abrimos un programa de referidos para egresados. Si usted conoce a alguien que necesite inglés de verdad</w:t>
               <w:br/>
-              <w:t>Si prefieres que no te escribamos más, dímelo y listo.</w:t>
+              <w:t>y se matricula, usted recibe $150.000 o 2 horas de clase 1-a-1, y su amigo tiene una clase de prueba antes de decidir.</w:t>
+              <w:br/>
+              <w:t>¿En quién piensa? Deme su nombre y su número, y avísele hoy que le vamos a escribir de su parte."</w:t>
             </w:r>
           </w:p>
         </w:tc>
@@ -1291,19 +1293,6 @@
     </w:p>
     <w:p>
       <w:pPr>
-        <w:spacing w:after="60"/>
-      </w:pPr>
-      <w:r>
-        <w:rPr>
-          <w:b w:val="0"/>
-          <w:color w:val="666666"/>
-          <w:sz w:val="19"/>
-        </w:rPr>
-        <w:t>Llamada al egresado (2 minutos): cómo te fue después del curso → "piensa en UNA persona que necesite inglés de verdad" → "no me des su número: te mando un mensaje y se lo reenvías; si escribe y se matricula, recibes $150.000 o 2 horas 1-a-1" → "¿a quién se lo vas a mandar hoy?" → mensaje enviado al colgar.</w:t>
-      </w:r>
-    </w:p>
-    <w:p>
-      <w:pPr>
         <w:spacing w:after="20"/>
       </w:pPr>
       <w:r>
@@ -1311,7 +1300,7 @@
           <w:b/>
           <w:sz w:val="20"/>
         </w:rPr>
-        <w:t>Primera respuesta al referido (desde la línea de Heiiu):</w:t>
+        <w:t>Mensaje al egresado que no contestó:</w:t>
       </w:r>
     </w:p>
     <w:tbl>
@@ -1338,11 +1327,11 @@
                 <w:i/>
                 <w:sz w:val="19"/>
               </w:rPr>
-              <w:t>Hola [nombre], gracias por escribir. Soy Juan Diego, profesor de Heiiu. Antes de seguir: usaremos tu nombre y número solo</w:t>
+              <w:t>Buenos días, [nombre], le habla Juan Diego, profesor de Heiiu. Usted terminó [nivel] con nosotros en [mes]. Abrimos un programa de</w:t>
               <w:br/>
-              <w:t>para darte información de nuestros programas, según nuestra política de datos [enlace]. ¿Nos autorizas? Responde SÍ.</w:t>
+              <w:t>referidos para egresados: si conoce a alguien que necesite inglés de verdad y se matricula, usted recibe $150.000 (o 2 horas de clase</w:t>
               <w:br/>
-              <w:t>(Puedes pedir que te borremos cuando quieras.)</w:t>
+              <w:t>1-a-1), y su amigo tiene una clase de prueba antes de decidir. ¿Puedo llamarle 2 minutos hoy o mañana para contarle cómo funciona?</w:t>
             </w:r>
           </w:p>
         </w:tc>
@@ -1352,6 +1341,70 @@
       <w:pPr>
         <w:spacing w:after="0"/>
       </w:pPr>
+    </w:p>
+    <w:p>
+      <w:pPr>
+        <w:spacing w:after="20"/>
+      </w:pPr>
+      <w:r>
+        <w:rPr>
+          <w:b/>
+          <w:sz w:val="20"/>
+        </w:rPr>
+        <w:t>Primer mensaje al referido (desde la línea de Heiiu, el mismo día que recibe el número):</w:t>
+      </w:r>
+    </w:p>
+    <w:tbl>
+      <w:tblPr>
+        <w:tblStyle w:val="TableGrid"/>
+        <w:tblW w:type="auto" w:w="0"/>
+        <w:tblLook w:firstColumn="1" w:firstRow="1" w:lastColumn="0" w:lastRow="0" w:noHBand="0" w:noVBand="1" w:val="04A0"/>
+      </w:tblPr>
+      <w:tblGrid>
+        <w:gridCol w:w="10200"/>
+      </w:tblGrid>
+      <w:tr>
+        <w:tc>
+          <w:tcPr>
+            <w:tcW w:type="dxa" w:w="10200"/>
+            <w:shd w:val="clear" w:color="auto" w:fill="FFF8E7"/>
+          </w:tcPr>
+          <w:p>
+            <w:pPr>
+              <w:spacing w:after="0"/>
+            </w:pPr>
+            <w:r>
+              <w:rPr>
+                <w:i/>
+                <w:sz w:val="19"/>
+              </w:rPr>
+              <w:t>Buenos días, [nombre]. Le escribe Juan Diego, profesor de Heiiu English Academy, en Bucaramanga. [Nombre de quien refiere] nos dio su</w:t>
+              <w:br/>
+              <w:t>número y nos dijo que usted necesita el inglés para [motivo, si lo sabe]. ¿Puedo llamarle 5 minutos hoy para contarle cómo trabajamos?</w:t>
+              <w:br/>
+              <w:t>Si prefiere que no le escribamos, respóndame NO y borro su número de inmediato.</w:t>
+            </w:r>
+          </w:p>
+        </w:tc>
+      </w:tr>
+    </w:tbl>
+    <w:p>
+      <w:pPr>
+        <w:spacing w:after="0"/>
+      </w:pPr>
+    </w:p>
+    <w:p>
+      <w:pPr>
+        <w:spacing w:after="60"/>
+      </w:pPr>
+      <w:r>
+        <w:rPr>
+          <w:b w:val="0"/>
+          <w:color w:val="666666"/>
+          <w:sz w:val="19"/>
+        </w:rPr>
+        <w:t>Con el SÍ o en la llamada: usaremos su nombre y su número solo para darle información de nuestros programas; puede pedir que lo borremos cuando quiera. Queda anotado en la planilla.</w:t>
+      </w:r>
     </w:p>
     <w:p>
       <w:pPr>
@@ -1439,7 +1492,7 @@
         <w:rPr>
           <w:sz w:val="20"/>
         </w:rPr>
-        <w:t>Lista de grupos activos con horarios y lista de egresados (coordinación).</w:t>
+        <w:t>Lista de grupos activos con horarios y lista de egresados con teléfono (coordinación).</w:t>
       </w:r>
     </w:p>
     <w:p>

</xml_diff>